<commit_message>
TS 3 Samhita and padam files reloaded on 30th Aug 2026
</commit_message>
<xml_diff>
--- a/TS-Padam/TS-3.4/TS 3.4 Tamil Pada Paatam Corrections.docx
+++ b/TS-Padam/TS-3.4/TS 3.4 Tamil Pada Paatam Corrections.docx
@@ -1,6 +1,6 @@
 
 <file path=word/document.xml><?xml version="1.0" encoding="utf-8"?>
-<w:document xmlns:wpc="http://schemas.microsoft.com/office/word/2010/wordprocessingCanvas" xmlns:cx="http://schemas.microsoft.com/office/drawing/2014/chartex" xmlns:cx1="http://schemas.microsoft.com/office/drawing/2015/9/8/chartex" xmlns:cx2="http://schemas.microsoft.com/office/drawing/2015/10/21/chartex" xmlns:cx3="http://schemas.microsoft.com/office/drawing/2016/5/9/chartex" xmlns:cx4="http://schemas.microsoft.com/office/drawing/2016/5/10/chartex" xmlns:cx5="http://schemas.microsoft.com/office/drawing/2016/5/11/chartex" xmlns:cx6="http://schemas.microsoft.com/office/drawing/2016/5/12/chartex" xmlns:cx7="http://schemas.microsoft.com/office/drawing/2016/5/13/chartex" xmlns:cx8="http://schemas.microsoft.com/office/drawing/2016/5/14/chartex" xmlns:mc="http://schemas.openxmlformats.org/markup-compatibility/2006" xmlns:aink="http://schemas.microsoft.com/office/drawing/2016/ink" xmlns:am3d="http://schemas.microsoft.com/office/drawing/2017/model3d" xmlns:o="urn:schemas-microsoft-com:office:office" xmlns:oel="http://schemas.microsoft.com/office/2019/extlst" xmlns:r="http://schemas.openxmlformats.org/officeDocument/2006/relationships" xmlns:m="http://schemas.openxmlformats.org/officeDocument/2006/math" xmlns:v="urn:schemas-microsoft-com:vml" xmlns:wp14="http://schemas.microsoft.com/office/word/2010/wordprocessingDrawing" xmlns:wp="http://schemas.openxmlformats.org/drawingml/2006/wordprocessingDrawing" xmlns:w10="urn:schemas-microsoft-com:office:word" xmlns:w="http://schemas.openxmlformats.org/wordprocessingml/2006/main" xmlns:w14="http://schemas.microsoft.com/office/word/2010/wordml" xmlns:w15="http://schemas.microsoft.com/office/word/2012/wordml" xmlns:w16cei="http://schemas.microsoft.com/office/word/2026/wordml/cei" xmlns:w16cex="http://schemas.microsoft.com/office/word/2018/wordml/cex" xmlns:w16cid="http://schemas.microsoft.com/office/word/2016/wordml/cid" xmlns:w16="http://schemas.microsoft.com/office/word/2018/wordml" xmlns:w16du="http://schemas.microsoft.com/office/word/2023/wordml/word16du" xmlns:w16sdtdh="http://schemas.microsoft.com/office/word/2020/wordml/sdtdatahash" xmlns:w16sdtfl="http://schemas.microsoft.com/office/word/2024/wordml/sdtformatlock" xmlns:w16se="http://schemas.microsoft.com/office/word/2015/wordml/symex" xmlns:wpg="http://schemas.microsoft.com/office/word/2010/wordprocessingGroup" xmlns:wpi="http://schemas.microsoft.com/office/word/2010/wordprocessingInk" xmlns:wne="http://schemas.microsoft.com/office/word/2006/wordml" xmlns:wps="http://schemas.microsoft.com/office/word/2010/wordprocessingShape" mc:Ignorable="w14 w15 w16se w16cid w16 w16cex w16sdtdh w16sdtfl w16du wp14">
+<w:document xmlns:wpc="http://schemas.microsoft.com/office/word/2010/wordprocessingCanvas" xmlns:cx="http://schemas.microsoft.com/office/drawing/2014/chartex" xmlns:cx1="http://schemas.microsoft.com/office/drawing/2015/9/8/chartex" xmlns:cx2="http://schemas.microsoft.com/office/drawing/2015/10/21/chartex" xmlns:cx3="http://schemas.microsoft.com/office/drawing/2016/5/9/chartex" xmlns:cx4="http://schemas.microsoft.com/office/drawing/2016/5/10/chartex" xmlns:cx5="http://schemas.microsoft.com/office/drawing/2016/5/11/chartex" xmlns:cx6="http://schemas.microsoft.com/office/drawing/2016/5/12/chartex" xmlns:cx7="http://schemas.microsoft.com/office/drawing/2016/5/13/chartex" xmlns:cx8="http://schemas.microsoft.com/office/drawing/2016/5/14/chartex" xmlns:mc="http://schemas.openxmlformats.org/markup-compatibility/2006" xmlns:aink="http://schemas.microsoft.com/office/drawing/2016/ink" xmlns:am3d="http://schemas.microsoft.com/office/drawing/2017/model3d" xmlns:o="urn:schemas-microsoft-com:office:office" xmlns:oel="http://schemas.microsoft.com/office/2019/extlst" xmlns:r="http://schemas.openxmlformats.org/officeDocument/2006/relationships" xmlns:m="http://schemas.openxmlformats.org/officeDocument/2006/math" xmlns:v="urn:schemas-microsoft-com:vml" xmlns:wp14="http://schemas.microsoft.com/office/word/2010/wordprocessingDrawing" xmlns:wp="http://schemas.openxmlformats.org/drawingml/2006/wordprocessingDrawing" xmlns:w10="urn:schemas-microsoft-com:office:word" xmlns:w="http://schemas.openxmlformats.org/wordprocessingml/2006/main" xmlns:w14="http://schemas.microsoft.com/office/word/2010/wordml" xmlns:w15="http://schemas.microsoft.com/office/word/2012/wordml" xmlns:w16cex="http://schemas.microsoft.com/office/word/2018/wordml/cex" xmlns:w16cid="http://schemas.microsoft.com/office/word/2016/wordml/cid" xmlns:w16="http://schemas.microsoft.com/office/word/2018/wordml" xmlns:w16du="http://schemas.microsoft.com/office/word/2023/wordml/word16du" xmlns:w16sdtdh="http://schemas.microsoft.com/office/word/2020/wordml/sdtdatahash" xmlns:w16sdtfl="http://schemas.microsoft.com/office/word/2024/wordml/sdtformatlock" xmlns:w16se="http://schemas.microsoft.com/office/word/2015/wordml/symex" xmlns:wpg="http://schemas.microsoft.com/office/word/2010/wordprocessingGroup" xmlns:wpi="http://schemas.microsoft.com/office/word/2010/wordprocessingInk" xmlns:wne="http://schemas.microsoft.com/office/word/2006/wordml" xmlns:wps="http://schemas.microsoft.com/office/word/2010/wordprocessingShape" mc:Ignorable="w14 w15 w16se w16cid w16 w16cex w16sdtdh w16sdtfl w16du wp14">
   <w:body>
     <w:p>
       <w:pPr>
@@ -3015,16 +3015,7 @@
                 <w:sz w:val="28"/>
                 <w:szCs w:val="28"/>
               </w:rPr>
-              <w:t>9.</w:t>
-            </w:r>
-            <w:r>
-              <w:rPr>
-                <w:b/>
-                <w:bCs/>
-                <w:sz w:val="28"/>
-                <w:szCs w:val="28"/>
-              </w:rPr>
-              <w:t>2</w:t>
+              <w:t>9.2</w:t>
             </w:r>
             <w:r>
               <w:rPr>
@@ -3062,16 +3053,7 @@
                 <w:sz w:val="28"/>
                 <w:szCs w:val="28"/>
               </w:rPr>
-              <w:t>2</w:t>
-            </w:r>
-            <w:r>
-              <w:rPr>
-                <w:b/>
-                <w:bCs/>
-                <w:sz w:val="28"/>
-                <w:szCs w:val="28"/>
-              </w:rPr>
-              <w:t>1</w:t>
+              <w:t>21</w:t>
             </w:r>
           </w:p>
           <w:p>
@@ -3607,16 +3589,7 @@
                 <w:sz w:val="28"/>
                 <w:szCs w:val="28"/>
               </w:rPr>
-              <w:t>9.</w:t>
-            </w:r>
-            <w:r>
-              <w:rPr>
-                <w:b/>
-                <w:bCs/>
-                <w:sz w:val="28"/>
-                <w:szCs w:val="28"/>
-              </w:rPr>
-              <w:t>6</w:t>
+              <w:t>9.6</w:t>
             </w:r>
             <w:r>
               <w:rPr>
@@ -4169,11 +4142,7 @@
           <w:u w:val="single"/>
         </w:rPr>
       </w:pPr>
-    </w:p>
-    <w:p>
-      <w:pPr>
-        <w:ind w:left="-142"/>
-        <w:jc w:val="center"/>
+      <w:r>
         <w:rPr>
           <w:b/>
           <w:bCs/>
@@ -4181,20 +4150,8 @@
           <w:szCs w:val="32"/>
           <w:u w:val="single"/>
         </w:rPr>
-      </w:pPr>
-    </w:p>
-    <w:p>
-      <w:pPr>
-        <w:ind w:left="-142"/>
-        <w:jc w:val="center"/>
-        <w:rPr>
-          <w:b/>
-          <w:bCs/>
-          <w:sz w:val="32"/>
-          <w:szCs w:val="32"/>
-          <w:u w:val="single"/>
-        </w:rPr>
-      </w:pPr>
+        <w:t>====================</w:t>
+      </w:r>
     </w:p>
     <w:p>
       <w:pPr>
@@ -4998,8 +4955,17 @@
                 <w:b/>
                 <w:bCs/>
               </w:rPr>
-              <w:t>(visargam</w:t>
-            </w:r>
+              <w:t>(</w:t>
+            </w:r>
+            <w:proofErr w:type="spellStart"/>
+            <w:r>
+              <w:rPr>
+                <w:b/>
+                <w:bCs/>
+              </w:rPr>
+              <w:t>visargam</w:t>
+            </w:r>
+            <w:proofErr w:type="spellEnd"/>
             <w:r>
               <w:rPr>
                 <w:rFonts w:ascii="Cambria" w:hAnsi="Cambria" w:cs="BRH Malayalam Extra"/>
@@ -5044,7 +5010,6 @@
                 <w:sz w:val="28"/>
                 <w:szCs w:val="28"/>
               </w:rPr>
-              <w:lastRenderedPageBreak/>
               <w:t>TS 3.4.</w:t>
             </w:r>
             <w:r>
@@ -5667,6 +5632,7 @@
                 <w:sz w:val="28"/>
                 <w:szCs w:val="28"/>
               </w:rPr>
+              <w:lastRenderedPageBreak/>
               <w:t>TS 3.4.</w:t>
             </w:r>
             <w:r>
@@ -6575,10 +6541,7 @@
           <w:u w:val="single"/>
         </w:rPr>
       </w:pPr>
-    </w:p>
-    <w:p>
-      <w:pPr>
-        <w:jc w:val="center"/>
+      <w:r>
         <w:rPr>
           <w:b/>
           <w:bCs/>
@@ -6586,19 +6549,8 @@
           <w:szCs w:val="32"/>
           <w:u w:val="single"/>
         </w:rPr>
-      </w:pPr>
-    </w:p>
-    <w:p>
-      <w:pPr>
-        <w:jc w:val="center"/>
-        <w:rPr>
-          <w:b/>
-          <w:bCs/>
-          <w:sz w:val="32"/>
-          <w:szCs w:val="32"/>
-          <w:u w:val="single"/>
-        </w:rPr>
-      </w:pPr>
+        <w:t>-----------------------------------------------------</w:t>
+      </w:r>
     </w:p>
     <w:p>
       <w:pPr>
@@ -7286,7 +7238,6 @@
                 <w:sz w:val="28"/>
                 <w:szCs w:val="28"/>
               </w:rPr>
-              <w:lastRenderedPageBreak/>
               <w:t>Panchaati No. - 14</w:t>
             </w:r>
           </w:p>
@@ -7312,7 +7263,6 @@
                 <w:cs/>
                 <w:lang w:bidi="ta-IN"/>
               </w:rPr>
-              <w:lastRenderedPageBreak/>
               <w:t>த</w:t>
             </w:r>
             <w:r>
@@ -8837,7 +8787,23 @@
                 <w:b/>
                 <w:bCs/>
               </w:rPr>
-              <w:t>(visargam removed)</w:t>
+              <w:t>(</w:t>
+            </w:r>
+            <w:proofErr w:type="spellStart"/>
+            <w:r>
+              <w:rPr>
+                <w:b/>
+                <w:bCs/>
+              </w:rPr>
+              <w:t>visargam</w:t>
+            </w:r>
+            <w:proofErr w:type="spellEnd"/>
+            <w:r>
+              <w:rPr>
+                <w:b/>
+                <w:bCs/>
+              </w:rPr>
+              <w:t xml:space="preserve"> removed)</w:t>
             </w:r>
           </w:p>
         </w:tc>
@@ -8862,6 +8828,7 @@
                 <w:sz w:val="28"/>
                 <w:szCs w:val="28"/>
               </w:rPr>
+              <w:lastRenderedPageBreak/>
               <w:t>TS 3.4.9.1 - Padam</w:t>
             </w:r>
           </w:p>
@@ -11074,8 +11041,21 @@
                 <w:szCs w:val="28"/>
                 <w:lang w:eastAsia="en-IN" w:bidi="ml-IN"/>
               </w:rPr>
-              <w:t>6th Panchaat</w:t>
-            </w:r>
+              <w:t xml:space="preserve">6th </w:t>
+            </w:r>
+            <w:proofErr w:type="spellStart"/>
+            <w:r>
+              <w:rPr>
+                <w:rFonts w:eastAsia="Times New Roman" w:cs="Arial"/>
+                <w:b/>
+                <w:bCs/>
+                <w:sz w:val="28"/>
+                <w:szCs w:val="28"/>
+                <w:lang w:eastAsia="en-IN" w:bidi="ml-IN"/>
+              </w:rPr>
+              <w:t>Panchaat</w:t>
+            </w:r>
+            <w:proofErr w:type="spellEnd"/>
           </w:p>
         </w:tc>
         <w:tc>
@@ -11541,8 +11521,21 @@
                 <w:szCs w:val="28"/>
                 <w:lang w:eastAsia="en-IN" w:bidi="ml-IN"/>
               </w:rPr>
-              <w:t>12th Panchaat</w:t>
-            </w:r>
+              <w:t xml:space="preserve">12th </w:t>
+            </w:r>
+            <w:proofErr w:type="spellStart"/>
+            <w:r>
+              <w:rPr>
+                <w:rFonts w:eastAsia="Times New Roman" w:cs="Arial"/>
+                <w:b/>
+                <w:bCs/>
+                <w:sz w:val="28"/>
+                <w:szCs w:val="28"/>
+                <w:lang w:eastAsia="en-IN" w:bidi="ml-IN"/>
+              </w:rPr>
+              <w:t>Panchaat</w:t>
+            </w:r>
+            <w:proofErr w:type="spellEnd"/>
           </w:p>
           <w:p>
             <w:pPr>
@@ -11873,14 +11866,23 @@
                 <w:sz w:val="36"/>
                 <w:szCs w:val="36"/>
               </w:rPr>
-              <w:t>ing visarg</w:t>
-            </w:r>
+              <w:t xml:space="preserve">ing </w:t>
+            </w:r>
+            <w:proofErr w:type="spellStart"/>
             <w:r>
               <w:rPr>
                 <w:rFonts w:cs="Arial"/>
                 <w:sz w:val="36"/>
                 <w:szCs w:val="36"/>
               </w:rPr>
+              <w:t>visarg</w:t>
+            </w:r>
+            <w:r>
+              <w:rPr>
+                <w:rFonts w:cs="Arial"/>
+                <w:sz w:val="36"/>
+                <w:szCs w:val="36"/>
+              </w:rPr>
               <w:t>a</w:t>
             </w:r>
             <w:r>
@@ -11889,7 +11891,16 @@
                 <w:sz w:val="36"/>
                 <w:szCs w:val="36"/>
               </w:rPr>
-              <w:t>m inserted)</w:t>
+              <w:t>m</w:t>
+            </w:r>
+            <w:proofErr w:type="spellEnd"/>
+            <w:r>
+              <w:rPr>
+                <w:rFonts w:cs="Arial"/>
+                <w:sz w:val="36"/>
+                <w:szCs w:val="36"/>
+              </w:rPr>
+              <w:t xml:space="preserve"> inserted)</w:t>
             </w:r>
           </w:p>
         </w:tc>
@@ -11961,8 +11972,21 @@
                 <w:szCs w:val="28"/>
                 <w:lang w:eastAsia="en-IN" w:bidi="ml-IN"/>
               </w:rPr>
-              <w:t>14th Panchaat</w:t>
-            </w:r>
+              <w:t xml:space="preserve">14th </w:t>
+            </w:r>
+            <w:proofErr w:type="spellStart"/>
+            <w:r>
+              <w:rPr>
+                <w:rFonts w:eastAsia="Times New Roman" w:cs="Arial"/>
+                <w:b/>
+                <w:bCs/>
+                <w:sz w:val="28"/>
+                <w:szCs w:val="28"/>
+                <w:lang w:eastAsia="en-IN" w:bidi="ml-IN"/>
+              </w:rPr>
+              <w:t>Panchaat</w:t>
+            </w:r>
+            <w:proofErr w:type="spellEnd"/>
           </w:p>
           <w:p>
             <w:pPr>
@@ -13164,7 +13188,25 @@
                 <w:sz w:val="32"/>
                 <w:szCs w:val="32"/>
               </w:rPr>
-              <w:t>(it is hraswam)</w:t>
+              <w:t xml:space="preserve">(it is </w:t>
+            </w:r>
+            <w:proofErr w:type="spellStart"/>
+            <w:r>
+              <w:rPr>
+                <w:rFonts w:cs="Arial"/>
+                <w:sz w:val="32"/>
+                <w:szCs w:val="32"/>
+              </w:rPr>
+              <w:t>hraswam</w:t>
+            </w:r>
+            <w:proofErr w:type="spellEnd"/>
+            <w:r>
+              <w:rPr>
+                <w:rFonts w:cs="Arial"/>
+                <w:sz w:val="32"/>
+                <w:szCs w:val="32"/>
+              </w:rPr>
+              <w:t>)</w:t>
             </w:r>
           </w:p>
         </w:tc>
@@ -13933,27 +13975,7 @@
                 <w:szCs w:val="28"/>
                 <w:lang w:bidi="ta-IN"/>
               </w:rPr>
-              <w:t xml:space="preserve"> from </w:t>
-            </w:r>
-            <w:proofErr w:type="gramStart"/>
-            <w:r>
-              <w:rPr>
-                <w:rFonts w:ascii="Latha" w:hAnsi="Latha" w:cs="Latha"/>
-                <w:sz w:val="28"/>
-                <w:szCs w:val="28"/>
-                <w:lang w:bidi="ta-IN"/>
-              </w:rPr>
-              <w:t>previous  Panchaati</w:t>
-            </w:r>
-            <w:proofErr w:type="gramEnd"/>
-            <w:r>
-              <w:rPr>
-                <w:rFonts w:ascii="Latha" w:hAnsi="Latha" w:cs="Latha"/>
-                <w:sz w:val="28"/>
-                <w:szCs w:val="28"/>
-                <w:lang w:bidi="ta-IN"/>
-              </w:rPr>
-              <w:t xml:space="preserve"> as per Sandhi</w:t>
+              <w:t xml:space="preserve"> from previous  Panchaati as per Sandhi</w:t>
             </w:r>
           </w:p>
         </w:tc>
@@ -13999,7 +14021,7 @@
 </file>
 
 <file path=word/endnotes.xml><?xml version="1.0" encoding="utf-8"?>
-<w:endnotes xmlns:wpc="http://schemas.microsoft.com/office/word/2010/wordprocessingCanvas" xmlns:cx="http://schemas.microsoft.com/office/drawing/2014/chartex" xmlns:cx1="http://schemas.microsoft.com/office/drawing/2015/9/8/chartex" xmlns:cx2="http://schemas.microsoft.com/office/drawing/2015/10/21/chartex" xmlns:cx3="http://schemas.microsoft.com/office/drawing/2016/5/9/chartex" xmlns:cx4="http://schemas.microsoft.com/office/drawing/2016/5/10/chartex" xmlns:cx5="http://schemas.microsoft.com/office/drawing/2016/5/11/chartex" xmlns:cx6="http://schemas.microsoft.com/office/drawing/2016/5/12/chartex" xmlns:cx7="http://schemas.microsoft.com/office/drawing/2016/5/13/chartex" xmlns:cx8="http://schemas.microsoft.com/office/drawing/2016/5/14/chartex" xmlns:mc="http://schemas.openxmlformats.org/markup-compatibility/2006" xmlns:aink="http://schemas.microsoft.com/office/drawing/2016/ink" xmlns:am3d="http://schemas.microsoft.com/office/drawing/2017/model3d" xmlns:o="urn:schemas-microsoft-com:office:office" xmlns:oel="http://schemas.microsoft.com/office/2019/extlst" xmlns:r="http://schemas.openxmlformats.org/officeDocument/2006/relationships" xmlns:m="http://schemas.openxmlformats.org/officeDocument/2006/math" xmlns:v="urn:schemas-microsoft-com:vml" xmlns:wp14="http://schemas.microsoft.com/office/word/2010/wordprocessingDrawing" xmlns:wp="http://schemas.openxmlformats.org/drawingml/2006/wordprocessingDrawing" xmlns:w10="urn:schemas-microsoft-com:office:word" xmlns:w="http://schemas.openxmlformats.org/wordprocessingml/2006/main" xmlns:w14="http://schemas.microsoft.com/office/word/2010/wordml" xmlns:w15="http://schemas.microsoft.com/office/word/2012/wordml" xmlns:w16cei="http://schemas.microsoft.com/office/word/2026/wordml/cei" xmlns:w16cex="http://schemas.microsoft.com/office/word/2018/wordml/cex" xmlns:w16cid="http://schemas.microsoft.com/office/word/2016/wordml/cid" xmlns:w16="http://schemas.microsoft.com/office/word/2018/wordml" xmlns:w16du="http://schemas.microsoft.com/office/word/2023/wordml/word16du" xmlns:w16sdtdh="http://schemas.microsoft.com/office/word/2020/wordml/sdtdatahash" xmlns:w16sdtfl="http://schemas.microsoft.com/office/word/2024/wordml/sdtformatlock" xmlns:w16se="http://schemas.microsoft.com/office/word/2015/wordml/symex" xmlns:wpg="http://schemas.microsoft.com/office/word/2010/wordprocessingGroup" xmlns:wpi="http://schemas.microsoft.com/office/word/2010/wordprocessingInk" xmlns:wne="http://schemas.microsoft.com/office/word/2006/wordml" xmlns:wps="http://schemas.microsoft.com/office/word/2010/wordprocessingShape" mc:Ignorable="w14 w15 w16se w16cid w16 w16cex w16sdtdh w16sdtfl w16du wp14">
+<w:endnotes xmlns:wpc="http://schemas.microsoft.com/office/word/2010/wordprocessingCanvas" xmlns:cx="http://schemas.microsoft.com/office/drawing/2014/chartex" xmlns:cx1="http://schemas.microsoft.com/office/drawing/2015/9/8/chartex" xmlns:cx2="http://schemas.microsoft.com/office/drawing/2015/10/21/chartex" xmlns:cx3="http://schemas.microsoft.com/office/drawing/2016/5/9/chartex" xmlns:cx4="http://schemas.microsoft.com/office/drawing/2016/5/10/chartex" xmlns:cx5="http://schemas.microsoft.com/office/drawing/2016/5/11/chartex" xmlns:cx6="http://schemas.microsoft.com/office/drawing/2016/5/12/chartex" xmlns:cx7="http://schemas.microsoft.com/office/drawing/2016/5/13/chartex" xmlns:cx8="http://schemas.microsoft.com/office/drawing/2016/5/14/chartex" xmlns:mc="http://schemas.openxmlformats.org/markup-compatibility/2006" xmlns:aink="http://schemas.microsoft.com/office/drawing/2016/ink" xmlns:am3d="http://schemas.microsoft.com/office/drawing/2017/model3d" xmlns:o="urn:schemas-microsoft-com:office:office" xmlns:oel="http://schemas.microsoft.com/office/2019/extlst" xmlns:r="http://schemas.openxmlformats.org/officeDocument/2006/relationships" xmlns:m="http://schemas.openxmlformats.org/officeDocument/2006/math" xmlns:v="urn:schemas-microsoft-com:vml" xmlns:wp14="http://schemas.microsoft.com/office/word/2010/wordprocessingDrawing" xmlns:wp="http://schemas.openxmlformats.org/drawingml/2006/wordprocessingDrawing" xmlns:w10="urn:schemas-microsoft-com:office:word" xmlns:w="http://schemas.openxmlformats.org/wordprocessingml/2006/main" xmlns:w14="http://schemas.microsoft.com/office/word/2010/wordml" xmlns:w15="http://schemas.microsoft.com/office/word/2012/wordml" xmlns:w16cex="http://schemas.microsoft.com/office/word/2018/wordml/cex" xmlns:w16cid="http://schemas.microsoft.com/office/word/2016/wordml/cid" xmlns:w16="http://schemas.microsoft.com/office/word/2018/wordml" xmlns:w16du="http://schemas.microsoft.com/office/word/2023/wordml/word16du" xmlns:w16sdtdh="http://schemas.microsoft.com/office/word/2020/wordml/sdtdatahash" xmlns:w16sdtfl="http://schemas.microsoft.com/office/word/2024/wordml/sdtformatlock" xmlns:w16se="http://schemas.microsoft.com/office/word/2015/wordml/symex" xmlns:wpg="http://schemas.microsoft.com/office/word/2010/wordprocessingGroup" xmlns:wpi="http://schemas.microsoft.com/office/word/2010/wordprocessingInk" xmlns:wne="http://schemas.microsoft.com/office/word/2006/wordml" xmlns:wps="http://schemas.microsoft.com/office/word/2010/wordprocessingShape" mc:Ignorable="w14 w15 w16se w16cid w16 w16cex w16sdtdh w16sdtfl w16du wp14">
   <w:endnote w:type="separator" w:id="-1">
     <w:p>
       <w:pPr>
@@ -14024,7 +14046,7 @@
 </file>
 
 <file path=word/footer1.xml><?xml version="1.0" encoding="utf-8"?>
-<w:ftr xmlns:wpc="http://schemas.microsoft.com/office/word/2010/wordprocessingCanvas" xmlns:cx="http://schemas.microsoft.com/office/drawing/2014/chartex" xmlns:cx1="http://schemas.microsoft.com/office/drawing/2015/9/8/chartex" xmlns:cx2="http://schemas.microsoft.com/office/drawing/2015/10/21/chartex" xmlns:cx3="http://schemas.microsoft.com/office/drawing/2016/5/9/chartex" xmlns:cx4="http://schemas.microsoft.com/office/drawing/2016/5/10/chartex" xmlns:cx5="http://schemas.microsoft.com/office/drawing/2016/5/11/chartex" xmlns:cx6="http://schemas.microsoft.com/office/drawing/2016/5/12/chartex" xmlns:cx7="http://schemas.microsoft.com/office/drawing/2016/5/13/chartex" xmlns:cx8="http://schemas.microsoft.com/office/drawing/2016/5/14/chartex" xmlns:mc="http://schemas.openxmlformats.org/markup-compatibility/2006" xmlns:aink="http://schemas.microsoft.com/office/drawing/2016/ink" xmlns:am3d="http://schemas.microsoft.com/office/drawing/2017/model3d" xmlns:o="urn:schemas-microsoft-com:office:office" xmlns:oel="http://schemas.microsoft.com/office/2019/extlst" xmlns:r="http://schemas.openxmlformats.org/officeDocument/2006/relationships" xmlns:m="http://schemas.openxmlformats.org/officeDocument/2006/math" xmlns:v="urn:schemas-microsoft-com:vml" xmlns:wp14="http://schemas.microsoft.com/office/word/2010/wordprocessingDrawing" xmlns:wp="http://schemas.openxmlformats.org/drawingml/2006/wordprocessingDrawing" xmlns:w10="urn:schemas-microsoft-com:office:word" xmlns:w="http://schemas.openxmlformats.org/wordprocessingml/2006/main" xmlns:w14="http://schemas.microsoft.com/office/word/2010/wordml" xmlns:w15="http://schemas.microsoft.com/office/word/2012/wordml" xmlns:w16cei="http://schemas.microsoft.com/office/word/2026/wordml/cei" xmlns:w16cex="http://schemas.microsoft.com/office/word/2018/wordml/cex" xmlns:w16cid="http://schemas.microsoft.com/office/word/2016/wordml/cid" xmlns:w16="http://schemas.microsoft.com/office/word/2018/wordml" xmlns:w16du="http://schemas.microsoft.com/office/word/2023/wordml/word16du" xmlns:w16sdtdh="http://schemas.microsoft.com/office/word/2020/wordml/sdtdatahash" xmlns:w16sdtfl="http://schemas.microsoft.com/office/word/2024/wordml/sdtformatlock" xmlns:w16se="http://schemas.microsoft.com/office/word/2015/wordml/symex" xmlns:wpg="http://schemas.microsoft.com/office/word/2010/wordprocessingGroup" xmlns:wpi="http://schemas.microsoft.com/office/word/2010/wordprocessingInk" xmlns:wne="http://schemas.microsoft.com/office/word/2006/wordml" xmlns:wps="http://schemas.microsoft.com/office/word/2010/wordprocessingShape" mc:Ignorable="w14 w15 w16se w16cid w16 w16cex w16sdtdh w16sdtfl w16du wp14">
+<w:ftr xmlns:wpc="http://schemas.microsoft.com/office/word/2010/wordprocessingCanvas" xmlns:cx="http://schemas.microsoft.com/office/drawing/2014/chartex" xmlns:cx1="http://schemas.microsoft.com/office/drawing/2015/9/8/chartex" xmlns:cx2="http://schemas.microsoft.com/office/drawing/2015/10/21/chartex" xmlns:cx3="http://schemas.microsoft.com/office/drawing/2016/5/9/chartex" xmlns:cx4="http://schemas.microsoft.com/office/drawing/2016/5/10/chartex" xmlns:cx5="http://schemas.microsoft.com/office/drawing/2016/5/11/chartex" xmlns:cx6="http://schemas.microsoft.com/office/drawing/2016/5/12/chartex" xmlns:cx7="http://schemas.microsoft.com/office/drawing/2016/5/13/chartex" xmlns:cx8="http://schemas.microsoft.com/office/drawing/2016/5/14/chartex" xmlns:mc="http://schemas.openxmlformats.org/markup-compatibility/2006" xmlns:aink="http://schemas.microsoft.com/office/drawing/2016/ink" xmlns:am3d="http://schemas.microsoft.com/office/drawing/2017/model3d" xmlns:o="urn:schemas-microsoft-com:office:office" xmlns:oel="http://schemas.microsoft.com/office/2019/extlst" xmlns:r="http://schemas.openxmlformats.org/officeDocument/2006/relationships" xmlns:m="http://schemas.openxmlformats.org/officeDocument/2006/math" xmlns:v="urn:schemas-microsoft-com:vml" xmlns:wp14="http://schemas.microsoft.com/office/word/2010/wordprocessingDrawing" xmlns:wp="http://schemas.openxmlformats.org/drawingml/2006/wordprocessingDrawing" xmlns:w10="urn:schemas-microsoft-com:office:word" xmlns:w="http://schemas.openxmlformats.org/wordprocessingml/2006/main" xmlns:w14="http://schemas.microsoft.com/office/word/2010/wordml" xmlns:w15="http://schemas.microsoft.com/office/word/2012/wordml" xmlns:w16cex="http://schemas.microsoft.com/office/word/2018/wordml/cex" xmlns:w16cid="http://schemas.microsoft.com/office/word/2016/wordml/cid" xmlns:w16="http://schemas.microsoft.com/office/word/2018/wordml" xmlns:w16du="http://schemas.microsoft.com/office/word/2023/wordml/word16du" xmlns:w16sdtdh="http://schemas.microsoft.com/office/word/2020/wordml/sdtdatahash" xmlns:w16sdtfl="http://schemas.microsoft.com/office/word/2024/wordml/sdtformatlock" xmlns:w16se="http://schemas.microsoft.com/office/word/2015/wordml/symex" xmlns:wpg="http://schemas.microsoft.com/office/word/2010/wordprocessingGroup" xmlns:wpi="http://schemas.microsoft.com/office/word/2010/wordprocessingInk" xmlns:wne="http://schemas.microsoft.com/office/word/2006/wordml" xmlns:wps="http://schemas.microsoft.com/office/word/2010/wordprocessingShape" mc:Ignorable="w14 w15 w16se w16cid w16 w16cex w16sdtdh w16sdtfl w16du wp14">
   <w:p>
     <w:pPr>
       <w:pBdr>
@@ -14213,7 +14235,7 @@
 </file>
 
 <file path=word/footer2.xml><?xml version="1.0" encoding="utf-8"?>
-<w:ftr xmlns:wpc="http://schemas.microsoft.com/office/word/2010/wordprocessingCanvas" xmlns:cx="http://schemas.microsoft.com/office/drawing/2014/chartex" xmlns:cx1="http://schemas.microsoft.com/office/drawing/2015/9/8/chartex" xmlns:cx2="http://schemas.microsoft.com/office/drawing/2015/10/21/chartex" xmlns:cx3="http://schemas.microsoft.com/office/drawing/2016/5/9/chartex" xmlns:cx4="http://schemas.microsoft.com/office/drawing/2016/5/10/chartex" xmlns:cx5="http://schemas.microsoft.com/office/drawing/2016/5/11/chartex" xmlns:cx6="http://schemas.microsoft.com/office/drawing/2016/5/12/chartex" xmlns:cx7="http://schemas.microsoft.com/office/drawing/2016/5/13/chartex" xmlns:cx8="http://schemas.microsoft.com/office/drawing/2016/5/14/chartex" xmlns:mc="http://schemas.openxmlformats.org/markup-compatibility/2006" xmlns:aink="http://schemas.microsoft.com/office/drawing/2016/ink" xmlns:am3d="http://schemas.microsoft.com/office/drawing/2017/model3d" xmlns:o="urn:schemas-microsoft-com:office:office" xmlns:oel="http://schemas.microsoft.com/office/2019/extlst" xmlns:r="http://schemas.openxmlformats.org/officeDocument/2006/relationships" xmlns:m="http://schemas.openxmlformats.org/officeDocument/2006/math" xmlns:v="urn:schemas-microsoft-com:vml" xmlns:wp14="http://schemas.microsoft.com/office/word/2010/wordprocessingDrawing" xmlns:wp="http://schemas.openxmlformats.org/drawingml/2006/wordprocessingDrawing" xmlns:w10="urn:schemas-microsoft-com:office:word" xmlns:w="http://schemas.openxmlformats.org/wordprocessingml/2006/main" xmlns:w14="http://schemas.microsoft.com/office/word/2010/wordml" xmlns:w15="http://schemas.microsoft.com/office/word/2012/wordml" xmlns:w16cei="http://schemas.microsoft.com/office/word/2026/wordml/cei" xmlns:w16cex="http://schemas.microsoft.com/office/word/2018/wordml/cex" xmlns:w16cid="http://schemas.microsoft.com/office/word/2016/wordml/cid" xmlns:w16="http://schemas.microsoft.com/office/word/2018/wordml" xmlns:w16du="http://schemas.microsoft.com/office/word/2023/wordml/word16du" xmlns:w16sdtdh="http://schemas.microsoft.com/office/word/2020/wordml/sdtdatahash" xmlns:w16sdtfl="http://schemas.microsoft.com/office/word/2024/wordml/sdtformatlock" xmlns:w16se="http://schemas.microsoft.com/office/word/2015/wordml/symex" xmlns:wpg="http://schemas.microsoft.com/office/word/2010/wordprocessingGroup" xmlns:wpi="http://schemas.microsoft.com/office/word/2010/wordprocessingInk" xmlns:wne="http://schemas.microsoft.com/office/word/2006/wordml" xmlns:wps="http://schemas.microsoft.com/office/word/2010/wordprocessingShape" mc:Ignorable="w14 w15 w16se w16cid w16 w16cex w16sdtdh w16sdtfl w16du wp14">
+<w:ftr xmlns:wpc="http://schemas.microsoft.com/office/word/2010/wordprocessingCanvas" xmlns:cx="http://schemas.microsoft.com/office/drawing/2014/chartex" xmlns:cx1="http://schemas.microsoft.com/office/drawing/2015/9/8/chartex" xmlns:cx2="http://schemas.microsoft.com/office/drawing/2015/10/21/chartex" xmlns:cx3="http://schemas.microsoft.com/office/drawing/2016/5/9/chartex" xmlns:cx4="http://schemas.microsoft.com/office/drawing/2016/5/10/chartex" xmlns:cx5="http://schemas.microsoft.com/office/drawing/2016/5/11/chartex" xmlns:cx6="http://schemas.microsoft.com/office/drawing/2016/5/12/chartex" xmlns:cx7="http://schemas.microsoft.com/office/drawing/2016/5/13/chartex" xmlns:cx8="http://schemas.microsoft.com/office/drawing/2016/5/14/chartex" xmlns:mc="http://schemas.openxmlformats.org/markup-compatibility/2006" xmlns:aink="http://schemas.microsoft.com/office/drawing/2016/ink" xmlns:am3d="http://schemas.microsoft.com/office/drawing/2017/model3d" xmlns:o="urn:schemas-microsoft-com:office:office" xmlns:oel="http://schemas.microsoft.com/office/2019/extlst" xmlns:r="http://schemas.openxmlformats.org/officeDocument/2006/relationships" xmlns:m="http://schemas.openxmlformats.org/officeDocument/2006/math" xmlns:v="urn:schemas-microsoft-com:vml" xmlns:wp14="http://schemas.microsoft.com/office/word/2010/wordprocessingDrawing" xmlns:wp="http://schemas.openxmlformats.org/drawingml/2006/wordprocessingDrawing" xmlns:w10="urn:schemas-microsoft-com:office:word" xmlns:w="http://schemas.openxmlformats.org/wordprocessingml/2006/main" xmlns:w14="http://schemas.microsoft.com/office/word/2010/wordml" xmlns:w15="http://schemas.microsoft.com/office/word/2012/wordml" xmlns:w16cex="http://schemas.microsoft.com/office/word/2018/wordml/cex" xmlns:w16cid="http://schemas.microsoft.com/office/word/2016/wordml/cid" xmlns:w16="http://schemas.microsoft.com/office/word/2018/wordml" xmlns:w16du="http://schemas.microsoft.com/office/word/2023/wordml/word16du" xmlns:w16sdtdh="http://schemas.microsoft.com/office/word/2020/wordml/sdtdatahash" xmlns:w16sdtfl="http://schemas.microsoft.com/office/word/2024/wordml/sdtformatlock" xmlns:w16se="http://schemas.microsoft.com/office/word/2015/wordml/symex" xmlns:wpg="http://schemas.microsoft.com/office/word/2010/wordprocessingGroup" xmlns:wpi="http://schemas.microsoft.com/office/word/2010/wordprocessingInk" xmlns:wne="http://schemas.microsoft.com/office/word/2006/wordml" xmlns:wps="http://schemas.microsoft.com/office/word/2010/wordprocessingShape" mc:Ignorable="w14 w15 w16se w16cid w16 w16cex w16sdtdh w16sdtfl w16du wp14">
   <w:p>
     <w:pPr>
       <w:pBdr>
@@ -14409,7 +14431,7 @@
 </file>
 
 <file path=word/footnotes.xml><?xml version="1.0" encoding="utf-8"?>
-<w:footnotes xmlns:wpc="http://schemas.microsoft.com/office/word/2010/wordprocessingCanvas" xmlns:cx="http://schemas.microsoft.com/office/drawing/2014/chartex" xmlns:cx1="http://schemas.microsoft.com/office/drawing/2015/9/8/chartex" xmlns:cx2="http://schemas.microsoft.com/office/drawing/2015/10/21/chartex" xmlns:cx3="http://schemas.microsoft.com/office/drawing/2016/5/9/chartex" xmlns:cx4="http://schemas.microsoft.com/office/drawing/2016/5/10/chartex" xmlns:cx5="http://schemas.microsoft.com/office/drawing/2016/5/11/chartex" xmlns:cx6="http://schemas.microsoft.com/office/drawing/2016/5/12/chartex" xmlns:cx7="http://schemas.microsoft.com/office/drawing/2016/5/13/chartex" xmlns:cx8="http://schemas.microsoft.com/office/drawing/2016/5/14/chartex" xmlns:mc="http://schemas.openxmlformats.org/markup-compatibility/2006" xmlns:aink="http://schemas.microsoft.com/office/drawing/2016/ink" xmlns:am3d="http://schemas.microsoft.com/office/drawing/2017/model3d" xmlns:o="urn:schemas-microsoft-com:office:office" xmlns:oel="http://schemas.microsoft.com/office/2019/extlst" xmlns:r="http://schemas.openxmlformats.org/officeDocument/2006/relationships" xmlns:m="http://schemas.openxmlformats.org/officeDocument/2006/math" xmlns:v="urn:schemas-microsoft-com:vml" xmlns:wp14="http://schemas.microsoft.com/office/word/2010/wordprocessingDrawing" xmlns:wp="http://schemas.openxmlformats.org/drawingml/2006/wordprocessingDrawing" xmlns:w10="urn:schemas-microsoft-com:office:word" xmlns:w="http://schemas.openxmlformats.org/wordprocessingml/2006/main" xmlns:w14="http://schemas.microsoft.com/office/word/2010/wordml" xmlns:w15="http://schemas.microsoft.com/office/word/2012/wordml" xmlns:w16cei="http://schemas.microsoft.com/office/word/2026/wordml/cei" xmlns:w16cex="http://schemas.microsoft.com/office/word/2018/wordml/cex" xmlns:w16cid="http://schemas.microsoft.com/office/word/2016/wordml/cid" xmlns:w16="http://schemas.microsoft.com/office/word/2018/wordml" xmlns:w16du="http://schemas.microsoft.com/office/word/2023/wordml/word16du" xmlns:w16sdtdh="http://schemas.microsoft.com/office/word/2020/wordml/sdtdatahash" xmlns:w16sdtfl="http://schemas.microsoft.com/office/word/2024/wordml/sdtformatlock" xmlns:w16se="http://schemas.microsoft.com/office/word/2015/wordml/symex" xmlns:wpg="http://schemas.microsoft.com/office/word/2010/wordprocessingGroup" xmlns:wpi="http://schemas.microsoft.com/office/word/2010/wordprocessingInk" xmlns:wne="http://schemas.microsoft.com/office/word/2006/wordml" xmlns:wps="http://schemas.microsoft.com/office/word/2010/wordprocessingShape" mc:Ignorable="w14 w15 w16se w16cid w16 w16cex w16sdtdh w16sdtfl w16du wp14">
+<w:footnotes xmlns:wpc="http://schemas.microsoft.com/office/word/2010/wordprocessingCanvas" xmlns:cx="http://schemas.microsoft.com/office/drawing/2014/chartex" xmlns:cx1="http://schemas.microsoft.com/office/drawing/2015/9/8/chartex" xmlns:cx2="http://schemas.microsoft.com/office/drawing/2015/10/21/chartex" xmlns:cx3="http://schemas.microsoft.com/office/drawing/2016/5/9/chartex" xmlns:cx4="http://schemas.microsoft.com/office/drawing/2016/5/10/chartex" xmlns:cx5="http://schemas.microsoft.com/office/drawing/2016/5/11/chartex" xmlns:cx6="http://schemas.microsoft.com/office/drawing/2016/5/12/chartex" xmlns:cx7="http://schemas.microsoft.com/office/drawing/2016/5/13/chartex" xmlns:cx8="http://schemas.microsoft.com/office/drawing/2016/5/14/chartex" xmlns:mc="http://schemas.openxmlformats.org/markup-compatibility/2006" xmlns:aink="http://schemas.microsoft.com/office/drawing/2016/ink" xmlns:am3d="http://schemas.microsoft.com/office/drawing/2017/model3d" xmlns:o="urn:schemas-microsoft-com:office:office" xmlns:oel="http://schemas.microsoft.com/office/2019/extlst" xmlns:r="http://schemas.openxmlformats.org/officeDocument/2006/relationships" xmlns:m="http://schemas.openxmlformats.org/officeDocument/2006/math" xmlns:v="urn:schemas-microsoft-com:vml" xmlns:wp14="http://schemas.microsoft.com/office/word/2010/wordprocessingDrawing" xmlns:wp="http://schemas.openxmlformats.org/drawingml/2006/wordprocessingDrawing" xmlns:w10="urn:schemas-microsoft-com:office:word" xmlns:w="http://schemas.openxmlformats.org/wordprocessingml/2006/main" xmlns:w14="http://schemas.microsoft.com/office/word/2010/wordml" xmlns:w15="http://schemas.microsoft.com/office/word/2012/wordml" xmlns:w16cex="http://schemas.microsoft.com/office/word/2018/wordml/cex" xmlns:w16cid="http://schemas.microsoft.com/office/word/2016/wordml/cid" xmlns:w16="http://schemas.microsoft.com/office/word/2018/wordml" xmlns:w16du="http://schemas.microsoft.com/office/word/2023/wordml/word16du" xmlns:w16sdtdh="http://schemas.microsoft.com/office/word/2020/wordml/sdtdatahash" xmlns:w16sdtfl="http://schemas.microsoft.com/office/word/2024/wordml/sdtformatlock" xmlns:w16se="http://schemas.microsoft.com/office/word/2015/wordml/symex" xmlns:wpg="http://schemas.microsoft.com/office/word/2010/wordprocessingGroup" xmlns:wpi="http://schemas.microsoft.com/office/word/2010/wordprocessingInk" xmlns:wne="http://schemas.microsoft.com/office/word/2006/wordml" xmlns:wps="http://schemas.microsoft.com/office/word/2010/wordprocessingShape" mc:Ignorable="w14 w15 w16se w16cid w16 w16cex w16sdtdh w16sdtfl w16du wp14">
   <w:footnote w:type="separator" w:id="-1">
     <w:p>
       <w:pPr>
@@ -14434,7 +14456,7 @@
 </file>
 
 <file path=word/header1.xml><?xml version="1.0" encoding="utf-8"?>
-<w:hdr xmlns:wpc="http://schemas.microsoft.com/office/word/2010/wordprocessingCanvas" xmlns:cx="http://schemas.microsoft.com/office/drawing/2014/chartex" xmlns:cx1="http://schemas.microsoft.com/office/drawing/2015/9/8/chartex" xmlns:cx2="http://schemas.microsoft.com/office/drawing/2015/10/21/chartex" xmlns:cx3="http://schemas.microsoft.com/office/drawing/2016/5/9/chartex" xmlns:cx4="http://schemas.microsoft.com/office/drawing/2016/5/10/chartex" xmlns:cx5="http://schemas.microsoft.com/office/drawing/2016/5/11/chartex" xmlns:cx6="http://schemas.microsoft.com/office/drawing/2016/5/12/chartex" xmlns:cx7="http://schemas.microsoft.com/office/drawing/2016/5/13/chartex" xmlns:cx8="http://schemas.microsoft.com/office/drawing/2016/5/14/chartex" xmlns:mc="http://schemas.openxmlformats.org/markup-compatibility/2006" xmlns:aink="http://schemas.microsoft.com/office/drawing/2016/ink" xmlns:am3d="http://schemas.microsoft.com/office/drawing/2017/model3d" xmlns:o="urn:schemas-microsoft-com:office:office" xmlns:oel="http://schemas.microsoft.com/office/2019/extlst" xmlns:r="http://schemas.openxmlformats.org/officeDocument/2006/relationships" xmlns:m="http://schemas.openxmlformats.org/officeDocument/2006/math" xmlns:v="urn:schemas-microsoft-com:vml" xmlns:wp14="http://schemas.microsoft.com/office/word/2010/wordprocessingDrawing" xmlns:wp="http://schemas.openxmlformats.org/drawingml/2006/wordprocessingDrawing" xmlns:w10="urn:schemas-microsoft-com:office:word" xmlns:w="http://schemas.openxmlformats.org/wordprocessingml/2006/main" xmlns:w14="http://schemas.microsoft.com/office/word/2010/wordml" xmlns:w15="http://schemas.microsoft.com/office/word/2012/wordml" xmlns:w16cei="http://schemas.microsoft.com/office/word/2026/wordml/cei" xmlns:w16cex="http://schemas.microsoft.com/office/word/2018/wordml/cex" xmlns:w16cid="http://schemas.microsoft.com/office/word/2016/wordml/cid" xmlns:w16="http://schemas.microsoft.com/office/word/2018/wordml" xmlns:w16du="http://schemas.microsoft.com/office/word/2023/wordml/word16du" xmlns:w16sdtdh="http://schemas.microsoft.com/office/word/2020/wordml/sdtdatahash" xmlns:w16sdtfl="http://schemas.microsoft.com/office/word/2024/wordml/sdtformatlock" xmlns:w16se="http://schemas.microsoft.com/office/word/2015/wordml/symex" xmlns:wpg="http://schemas.microsoft.com/office/word/2010/wordprocessingGroup" xmlns:wpi="http://schemas.microsoft.com/office/word/2010/wordprocessingInk" xmlns:wne="http://schemas.microsoft.com/office/word/2006/wordml" xmlns:wps="http://schemas.microsoft.com/office/word/2010/wordprocessingShape" mc:Ignorable="w14 w15 w16se w16cid w16 w16cex w16sdtdh w16sdtfl w16du wp14">
+<w:hdr xmlns:wpc="http://schemas.microsoft.com/office/word/2010/wordprocessingCanvas" xmlns:cx="http://schemas.microsoft.com/office/drawing/2014/chartex" xmlns:cx1="http://schemas.microsoft.com/office/drawing/2015/9/8/chartex" xmlns:cx2="http://schemas.microsoft.com/office/drawing/2015/10/21/chartex" xmlns:cx3="http://schemas.microsoft.com/office/drawing/2016/5/9/chartex" xmlns:cx4="http://schemas.microsoft.com/office/drawing/2016/5/10/chartex" xmlns:cx5="http://schemas.microsoft.com/office/drawing/2016/5/11/chartex" xmlns:cx6="http://schemas.microsoft.com/office/drawing/2016/5/12/chartex" xmlns:cx7="http://schemas.microsoft.com/office/drawing/2016/5/13/chartex" xmlns:cx8="http://schemas.microsoft.com/office/drawing/2016/5/14/chartex" xmlns:mc="http://schemas.openxmlformats.org/markup-compatibility/2006" xmlns:aink="http://schemas.microsoft.com/office/drawing/2016/ink" xmlns:am3d="http://schemas.microsoft.com/office/drawing/2017/model3d" xmlns:o="urn:schemas-microsoft-com:office:office" xmlns:oel="http://schemas.microsoft.com/office/2019/extlst" xmlns:r="http://schemas.openxmlformats.org/officeDocument/2006/relationships" xmlns:m="http://schemas.openxmlformats.org/officeDocument/2006/math" xmlns:v="urn:schemas-microsoft-com:vml" xmlns:wp14="http://schemas.microsoft.com/office/word/2010/wordprocessingDrawing" xmlns:wp="http://schemas.openxmlformats.org/drawingml/2006/wordprocessingDrawing" xmlns:w10="urn:schemas-microsoft-com:office:word" xmlns:w="http://schemas.openxmlformats.org/wordprocessingml/2006/main" xmlns:w14="http://schemas.microsoft.com/office/word/2010/wordml" xmlns:w15="http://schemas.microsoft.com/office/word/2012/wordml" xmlns:w16cex="http://schemas.microsoft.com/office/word/2018/wordml/cex" xmlns:w16cid="http://schemas.microsoft.com/office/word/2016/wordml/cid" xmlns:w16="http://schemas.microsoft.com/office/word/2018/wordml" xmlns:w16du="http://schemas.microsoft.com/office/word/2023/wordml/word16du" xmlns:w16sdtdh="http://schemas.microsoft.com/office/word/2020/wordml/sdtdatahash" xmlns:w16sdtfl="http://schemas.microsoft.com/office/word/2024/wordml/sdtformatlock" xmlns:w16se="http://schemas.microsoft.com/office/word/2015/wordml/symex" xmlns:wpg="http://schemas.microsoft.com/office/word/2010/wordprocessingGroup" xmlns:wpi="http://schemas.microsoft.com/office/word/2010/wordprocessingInk" xmlns:wne="http://schemas.microsoft.com/office/word/2006/wordml" xmlns:wps="http://schemas.microsoft.com/office/word/2010/wordprocessingShape" mc:Ignorable="w14 w15 w16se w16cid w16 w16cex w16sdtdh w16sdtfl w16du wp14">
   <w:p>
     <w:pPr>
       <w:pStyle w:val="Header"/>
@@ -14447,7 +14469,7 @@
 </file>
 
 <file path=word/header2.xml><?xml version="1.0" encoding="utf-8"?>
-<w:hdr xmlns:wpc="http://schemas.microsoft.com/office/word/2010/wordprocessingCanvas" xmlns:cx="http://schemas.microsoft.com/office/drawing/2014/chartex" xmlns:cx1="http://schemas.microsoft.com/office/drawing/2015/9/8/chartex" xmlns:cx2="http://schemas.microsoft.com/office/drawing/2015/10/21/chartex" xmlns:cx3="http://schemas.microsoft.com/office/drawing/2016/5/9/chartex" xmlns:cx4="http://schemas.microsoft.com/office/drawing/2016/5/10/chartex" xmlns:cx5="http://schemas.microsoft.com/office/drawing/2016/5/11/chartex" xmlns:cx6="http://schemas.microsoft.com/office/drawing/2016/5/12/chartex" xmlns:cx7="http://schemas.microsoft.com/office/drawing/2016/5/13/chartex" xmlns:cx8="http://schemas.microsoft.com/office/drawing/2016/5/14/chartex" xmlns:mc="http://schemas.openxmlformats.org/markup-compatibility/2006" xmlns:aink="http://schemas.microsoft.com/office/drawing/2016/ink" xmlns:am3d="http://schemas.microsoft.com/office/drawing/2017/model3d" xmlns:o="urn:schemas-microsoft-com:office:office" xmlns:oel="http://schemas.microsoft.com/office/2019/extlst" xmlns:r="http://schemas.openxmlformats.org/officeDocument/2006/relationships" xmlns:m="http://schemas.openxmlformats.org/officeDocument/2006/math" xmlns:v="urn:schemas-microsoft-com:vml" xmlns:wp14="http://schemas.microsoft.com/office/word/2010/wordprocessingDrawing" xmlns:wp="http://schemas.openxmlformats.org/drawingml/2006/wordprocessingDrawing" xmlns:w10="urn:schemas-microsoft-com:office:word" xmlns:w="http://schemas.openxmlformats.org/wordprocessingml/2006/main" xmlns:w14="http://schemas.microsoft.com/office/word/2010/wordml" xmlns:w15="http://schemas.microsoft.com/office/word/2012/wordml" xmlns:w16cei="http://schemas.microsoft.com/office/word/2026/wordml/cei" xmlns:w16cex="http://schemas.microsoft.com/office/word/2018/wordml/cex" xmlns:w16cid="http://schemas.microsoft.com/office/word/2016/wordml/cid" xmlns:w16="http://schemas.microsoft.com/office/word/2018/wordml" xmlns:w16du="http://schemas.microsoft.com/office/word/2023/wordml/word16du" xmlns:w16sdtdh="http://schemas.microsoft.com/office/word/2020/wordml/sdtdatahash" xmlns:w16sdtfl="http://schemas.microsoft.com/office/word/2024/wordml/sdtformatlock" xmlns:w16se="http://schemas.microsoft.com/office/word/2015/wordml/symex" xmlns:wpg="http://schemas.microsoft.com/office/word/2010/wordprocessingGroup" xmlns:wpi="http://schemas.microsoft.com/office/word/2010/wordprocessingInk" xmlns:wne="http://schemas.microsoft.com/office/word/2006/wordml" xmlns:wps="http://schemas.microsoft.com/office/word/2010/wordprocessingShape" mc:Ignorable="w14 w15 w16se w16cid w16 w16cex w16sdtdh w16sdtfl w16du wp14">
+<w:hdr xmlns:wpc="http://schemas.microsoft.com/office/word/2010/wordprocessingCanvas" xmlns:cx="http://schemas.microsoft.com/office/drawing/2014/chartex" xmlns:cx1="http://schemas.microsoft.com/office/drawing/2015/9/8/chartex" xmlns:cx2="http://schemas.microsoft.com/office/drawing/2015/10/21/chartex" xmlns:cx3="http://schemas.microsoft.com/office/drawing/2016/5/9/chartex" xmlns:cx4="http://schemas.microsoft.com/office/drawing/2016/5/10/chartex" xmlns:cx5="http://schemas.microsoft.com/office/drawing/2016/5/11/chartex" xmlns:cx6="http://schemas.microsoft.com/office/drawing/2016/5/12/chartex" xmlns:cx7="http://schemas.microsoft.com/office/drawing/2016/5/13/chartex" xmlns:cx8="http://schemas.microsoft.com/office/drawing/2016/5/14/chartex" xmlns:mc="http://schemas.openxmlformats.org/markup-compatibility/2006" xmlns:aink="http://schemas.microsoft.com/office/drawing/2016/ink" xmlns:am3d="http://schemas.microsoft.com/office/drawing/2017/model3d" xmlns:o="urn:schemas-microsoft-com:office:office" xmlns:oel="http://schemas.microsoft.com/office/2019/extlst" xmlns:r="http://schemas.openxmlformats.org/officeDocument/2006/relationships" xmlns:m="http://schemas.openxmlformats.org/officeDocument/2006/math" xmlns:v="urn:schemas-microsoft-com:vml" xmlns:wp14="http://schemas.microsoft.com/office/word/2010/wordprocessingDrawing" xmlns:wp="http://schemas.openxmlformats.org/drawingml/2006/wordprocessingDrawing" xmlns:w10="urn:schemas-microsoft-com:office:word" xmlns:w="http://schemas.openxmlformats.org/wordprocessingml/2006/main" xmlns:w14="http://schemas.microsoft.com/office/word/2010/wordml" xmlns:w15="http://schemas.microsoft.com/office/word/2012/wordml" xmlns:w16cex="http://schemas.microsoft.com/office/word/2018/wordml/cex" xmlns:w16cid="http://schemas.microsoft.com/office/word/2016/wordml/cid" xmlns:w16="http://schemas.microsoft.com/office/word/2018/wordml" xmlns:w16du="http://schemas.microsoft.com/office/word/2023/wordml/word16du" xmlns:w16sdtdh="http://schemas.microsoft.com/office/word/2020/wordml/sdtdatahash" xmlns:w16sdtfl="http://schemas.microsoft.com/office/word/2024/wordml/sdtformatlock" xmlns:w16se="http://schemas.microsoft.com/office/word/2015/wordml/symex" xmlns:wpg="http://schemas.microsoft.com/office/word/2010/wordprocessingGroup" xmlns:wpi="http://schemas.microsoft.com/office/word/2010/wordprocessingInk" xmlns:wne="http://schemas.microsoft.com/office/word/2006/wordml" xmlns:wps="http://schemas.microsoft.com/office/word/2010/wordprocessingShape" mc:Ignorable="w14 w15 w16se w16cid w16 w16cex w16sdtdh w16sdtfl w16du wp14">
   <w:p>
     <w:pPr>
       <w:pStyle w:val="Header"/>

</xml_diff>